<commit_message>
feat: optimize validation sync pipeline and integrate Google Sync button in UI
</commit_message>
<xml_diff>
--- a/docs/Data_Cleaning_Workflow.docx
+++ b/docs/Data_Cleaning_Workflow.docx
@@ -280,6 +280,83 @@
       </w:pPr>
       <w:r>
         <w:t>• Transaction Rollbacks: The entire data movement (inserting to uncleaned tables and deleting from master) is wrapped in a strict SQL Transaction. If any column mismatch or failure occurs, the database automatically rolls back, preventing data corruption or partial deletions.</w:t>
+      </w:r>
+    </w:p>
+    <w:p>
+      <w:pPr>
+        <w:pStyle w:val="Heading2"/>
+        <w:spacing w:before="360" w:after="120"/>
+      </w:pPr>
+      <w:r>
+        <w:t>5. Data Sync &amp; Validation Pipelines Architecture</w:t>
+      </w:r>
+    </w:p>
+    <w:p>
+      <w:pPr>
+        <w:spacing w:after="240"/>
+      </w:pPr>
+      <w:r>
+        <w:t>The dashboard automates three primary database synchronization and ETL pipelines to manage high-volume directories and products:</w:t>
+      </w:r>
+    </w:p>
+    <w:p>
+      <w:pPr>
+        <w:pStyle w:val="Heading3"/>
+      </w:pPr>
+      <w:r>
+        <w:t>A. Google Drive Ingestion Pipeline</w:t>
+      </w:r>
+    </w:p>
+    <w:p>
+      <w:pPr>
+        <w:spacing w:after="240"/>
+      </w:pPr>
+      <w:r>
+        <w:t>• Purpose: Automatically detects and imports location spreadsheets from Google Drive folders.</w:t>
+        <w:br/>
+        <w:t>• Flow: Celery background listeners monitor registered folders. New files are streamed in chunks and written to raw_google_map_drive_data.</w:t>
+        <w:br/>
+        <w:t>• Validation &amp; Deduplication: Each row is verified using a 3-layer check (missing values, phone format validation, geographic lookup). Valid records are signature-hashed to exclude duplicates, then processed in safe batches of 50,000 using the sync script to populate g_map_master_table.</w:t>
+      </w:r>
+    </w:p>
+    <w:p>
+      <w:pPr>
+        <w:pStyle w:val="Heading3"/>
+      </w:pPr>
+      <w:r>
+        <w:t>B. E-Commerce Product Pipeline</w:t>
+      </w:r>
+    </w:p>
+    <w:p>
+      <w:pPr>
+        <w:spacing w:after="240"/>
+      </w:pPr>
+      <w:r>
+        <w:t>• Purpose: Normalizes and consolidates product items scraped from multiple e-commerce sources (Zepto, Blinkit, DMart, JioMart, Amazon, Flipkart, etc.).</w:t>
+        <w:br/>
+        <w:t>• Flow: Scraped items are initially imported into individual staging tables. The data cleaning service processes them, checking for price validity and valid category mapping matching the canonical taxonomies list.</w:t>
+        <w:br/>
+        <w:t>• Integration: Clean items are consolidated into product_master. Items with unmapped/invalid categories are isolated in uncleaned_product_master_table for manual review, and bulk-reintegrated into the master table once corrected.</w:t>
+      </w:r>
+    </w:p>
+    <w:p>
+      <w:pPr>
+        <w:pStyle w:val="Heading3"/>
+      </w:pPr>
+      <w:r>
+        <w:t>C. Business Listings Pipeline</w:t>
+      </w:r>
+    </w:p>
+    <w:p>
+      <w:pPr>
+        <w:spacing w:after="240"/>
+      </w:pPr>
+      <w:r>
+        <w:t>• Purpose: Sanitizes and filters duplicate search directory listings.</w:t>
+        <w:br/>
+        <w:t>• Flow: Directory inputs are checked for contact formatting correctness and normalized. Cities are cross-referenced against location_master to repair spelling/postal errors.</w:t>
+        <w:br/>
+        <w:t>• Optimization: Listings are written to master_table. Group duplicates are resolved in MySQL using a min_id exclusion query, avoiding RAM bottlenecks and enabling fast pagination and search query speeds in the dashboard UI.</w:t>
       </w:r>
     </w:p>
     <w:sectPr>

</xml_diff>